<commit_message>
Wire compiled Field Guide to owner's finished diagram PNGs
Both compilers now prefer a finished PNG in diagrams/ (matched by basename)
over the SVG placeholder or mermaid source for every diagram and decision
tree, falling back only when no PNG exists. Images are downsampled so the
HTML (3.5MB) and DOCX (3.6MB) stay light enough to email.

All 19 owner-supplied diagrams now render in both outputs; zero mermaid
fallbacks remain.
</commit_message>
<xml_diff>
--- a/docs/manual/field-guide.docx
+++ b/docs/manual/field-guide.docx
@@ -238,12 +238,42 @@
       </w:r>
     </w:p>
     <w:p>
-      <w:r>
-        <w:rPr>
-          <w:i/>
-          <w:color w:val="8A7A64"/>
-        </w:rPr>
-        <w:t>[ Decision tree — see the diagram file ]</w:t>
+      <w:pPr>
+        <w:jc w:val="center"/>
+      </w:pPr>
+      <w:r>
+        <w:drawing>
+          <wp:inline xmlns:a="http://schemas.openxmlformats.org/drawingml/2006/main" xmlns:pic="http://schemas.openxmlformats.org/drawingml/2006/picture">
+            <wp:extent cx="4023360" cy="10060937"/>
+            <wp:docPr id="1" name="Picture 1"/>
+            <wp:cNvGraphicFramePr>
+              <a:graphicFrameLocks noChangeAspect="1"/>
+            </wp:cNvGraphicFramePr>
+            <a:graphic>
+              <a:graphicData uri="http://schemas.openxmlformats.org/drawingml/2006/picture">
+                <pic:pic>
+                  <pic:nvPicPr>
+                    <pic:cNvPr id="0" name="image.jpg"/>
+                    <pic:cNvPicPr/>
+                  </pic:nvPicPr>
+                  <pic:blipFill>
+                    <a:blip r:embed="rId9"/>
+                    <a:stretch>
+                      <a:fillRect/>
+                    </a:stretch>
+                  </pic:blipFill>
+                  <pic:spPr>
+                    <a:xfrm>
+                      <a:off x="0" y="0"/>
+                      <a:ext cx="4023360" cy="10060937"/>
+                    </a:xfrm>
+                    <a:prstGeom prst="rect"/>
+                  </pic:spPr>
+                </pic:pic>
+              </a:graphicData>
+            </a:graphic>
+          </wp:inline>
+        </w:drawing>
       </w:r>
     </w:p>
     <w:p>
@@ -1857,8 +1887,8 @@
       <w:r>
         <w:drawing>
           <wp:inline xmlns:a="http://schemas.openxmlformats.org/drawingml/2006/main" xmlns:pic="http://schemas.openxmlformats.org/drawingml/2006/picture">
-            <wp:extent cx="4023360" cy="1430528"/>
-            <wp:docPr id="1" name="Picture 1"/>
+            <wp:extent cx="4023360" cy="1342078"/>
+            <wp:docPr id="2" name="Picture 2"/>
             <wp:cNvGraphicFramePr>
               <a:graphicFrameLocks noChangeAspect="1"/>
             </wp:cNvGraphicFramePr>
@@ -1866,11 +1896,11 @@
               <a:graphicData uri="http://schemas.openxmlformats.org/drawingml/2006/picture">
                 <pic:pic>
                   <pic:nvPicPr>
-                    <pic:cNvPr id="0" name="windsor-back-types.png"/>
+                    <pic:cNvPr id="0" name="image.jpg"/>
                     <pic:cNvPicPr/>
                   </pic:nvPicPr>
                   <pic:blipFill>
-                    <a:blip r:embed="rId9"/>
+                    <a:blip r:embed="rId10"/>
                     <a:stretch>
                       <a:fillRect/>
                     </a:stretch>
@@ -1878,7 +1908,7 @@
                   <pic:spPr>
                     <a:xfrm>
                       <a:off x="0" y="0"/>
-                      <a:ext cx="4023360" cy="1430528"/>
+                      <a:ext cx="4023360" cy="1342078"/>
                     </a:xfrm>
                     <a:prstGeom prst="rect"/>
                   </pic:spPr>
@@ -2442,8 +2472,8 @@
       <w:r>
         <w:drawing>
           <wp:inline xmlns:a="http://schemas.openxmlformats.org/drawingml/2006/main" xmlns:pic="http://schemas.openxmlformats.org/drawingml/2006/picture">
-            <wp:extent cx="4023360" cy="1488643"/>
-            <wp:docPr id="2" name="Picture 2"/>
+            <wp:extent cx="4023360" cy="1342078"/>
+            <wp:docPr id="3" name="Picture 3"/>
             <wp:cNvGraphicFramePr>
               <a:graphicFrameLocks noChangeAspect="1"/>
             </wp:cNvGraphicFramePr>
@@ -2451,11 +2481,11 @@
               <a:graphicData uri="http://schemas.openxmlformats.org/drawingml/2006/picture">
                 <pic:pic>
                   <pic:nvPicPr>
-                    <pic:cNvPr id="0" name="rocker-types.png"/>
+                    <pic:cNvPr id="0" name="image.jpg"/>
                     <pic:cNvPicPr/>
                   </pic:nvPicPr>
                   <pic:blipFill>
-                    <a:blip r:embed="rId10"/>
+                    <a:blip r:embed="rId11"/>
                     <a:stretch>
                       <a:fillRect/>
                     </a:stretch>
@@ -2463,7 +2493,7 @@
                   <pic:spPr>
                     <a:xfrm>
                       <a:off x="0" y="0"/>
-                      <a:ext cx="4023360" cy="1488643"/>
+                      <a:ext cx="4023360" cy="1342078"/>
                     </a:xfrm>
                     <a:prstGeom prst="rect"/>
                   </pic:spPr>
@@ -3993,8 +4023,8 @@
       <w:r>
         <w:drawing>
           <wp:inline xmlns:a="http://schemas.openxmlformats.org/drawingml/2006/main" xmlns:pic="http://schemas.openxmlformats.org/drawingml/2006/picture">
-            <wp:extent cx="4023360" cy="1698752"/>
-            <wp:docPr id="3" name="Picture 3"/>
+            <wp:extent cx="4023360" cy="1342078"/>
+            <wp:docPr id="4" name="Picture 4"/>
             <wp:cNvGraphicFramePr>
               <a:graphicFrameLocks noChangeAspect="1"/>
             </wp:cNvGraphicFramePr>
@@ -4002,11 +4032,11 @@
               <a:graphicData uri="http://schemas.openxmlformats.org/drawingml/2006/picture">
                 <pic:pic>
                   <pic:nvPicPr>
-                    <pic:cNvPr id="0" name="legs-by-period.png"/>
+                    <pic:cNvPr id="0" name="image.jpg"/>
                     <pic:cNvPicPr/>
                   </pic:nvPicPr>
                   <pic:blipFill>
-                    <a:blip r:embed="rId11"/>
+                    <a:blip r:embed="rId12"/>
                     <a:stretch>
                       <a:fillRect/>
                     </a:stretch>
@@ -4014,7 +4044,7 @@
                   <pic:spPr>
                     <a:xfrm>
                       <a:off x="0" y="0"/>
-                      <a:ext cx="4023360" cy="1698752"/>
+                      <a:ext cx="4023360" cy="1342078"/>
                     </a:xfrm>
                     <a:prstGeom prst="rect"/>
                   </pic:spPr>
@@ -5352,8 +5382,8 @@
       <w:r>
         <w:drawing>
           <wp:inline xmlns:a="http://schemas.openxmlformats.org/drawingml/2006/main" xmlns:pic="http://schemas.openxmlformats.org/drawingml/2006/picture">
-            <wp:extent cx="4023360" cy="1399235"/>
-            <wp:docPr id="4" name="Picture 4"/>
+            <wp:extent cx="4023360" cy="1342078"/>
+            <wp:docPr id="5" name="Picture 5"/>
             <wp:cNvGraphicFramePr>
               <a:graphicFrameLocks noChangeAspect="1"/>
             </wp:cNvGraphicFramePr>
@@ -5361,11 +5391,11 @@
               <a:graphicData uri="http://schemas.openxmlformats.org/drawingml/2006/picture">
                 <pic:pic>
                   <pic:nvPicPr>
-                    <pic:cNvPr id="0" name="victorian-sofa-silhouettes.png"/>
+                    <pic:cNvPr id="0" name="image.jpg"/>
                     <pic:cNvPicPr/>
                   </pic:nvPicPr>
                   <pic:blipFill>
-                    <a:blip r:embed="rId12"/>
+                    <a:blip r:embed="rId13"/>
                     <a:stretch>
                       <a:fillRect/>
                     </a:stretch>
@@ -5373,7 +5403,7 @@
                   <pic:spPr>
                     <a:xfrm>
                       <a:off x="0" y="0"/>
-                      <a:ext cx="4023360" cy="1399235"/>
+                      <a:ext cx="4023360" cy="1342078"/>
                     </a:xfrm>
                     <a:prstGeom prst="rect"/>
                   </pic:spPr>
@@ -5994,8 +6024,8 @@
       <w:r>
         <w:drawing>
           <wp:inline xmlns:a="http://schemas.openxmlformats.org/drawingml/2006/main" xmlns:pic="http://schemas.openxmlformats.org/drawingml/2006/picture">
-            <wp:extent cx="4023360" cy="1899920"/>
-            <wp:docPr id="5" name="Picture 5"/>
+            <wp:extent cx="4023360" cy="1342078"/>
+            <wp:docPr id="6" name="Picture 6"/>
             <wp:cNvGraphicFramePr>
               <a:graphicFrameLocks noChangeAspect="1"/>
             </wp:cNvGraphicFramePr>
@@ -6003,11 +6033,11 @@
               <a:graphicData uri="http://schemas.openxmlformats.org/drawingml/2006/picture">
                 <pic:pic>
                   <pic:nvPicPr>
-                    <pic:cNvPr id="0" name="table-base-styles.png"/>
+                    <pic:cNvPr id="0" name="image.jpg"/>
                     <pic:cNvPicPr/>
                   </pic:nvPicPr>
                   <pic:blipFill>
-                    <a:blip r:embed="rId13"/>
+                    <a:blip r:embed="rId14"/>
                     <a:stretch>
                       <a:fillRect/>
                     </a:stretch>
@@ -6015,7 +6045,7 @@
                   <pic:spPr>
                     <a:xfrm>
                       <a:off x="0" y="0"/>
-                      <a:ext cx="4023360" cy="1899920"/>
+                      <a:ext cx="4023360" cy="1342078"/>
                     </a:xfrm>
                     <a:prstGeom prst="rect"/>
                   </pic:spPr>
@@ -6635,8 +6665,8 @@
       <w:r>
         <w:drawing>
           <wp:inline xmlns:a="http://schemas.openxmlformats.org/drawingml/2006/main" xmlns:pic="http://schemas.openxmlformats.org/drawingml/2006/picture">
-            <wp:extent cx="4023360" cy="1788160"/>
-            <wp:docPr id="6" name="Picture 6"/>
+            <wp:extent cx="4023360" cy="1342078"/>
+            <wp:docPr id="7" name="Picture 7"/>
             <wp:cNvGraphicFramePr>
               <a:graphicFrameLocks noChangeAspect="1"/>
             </wp:cNvGraphicFramePr>
@@ -6644,11 +6674,11 @@
               <a:graphicData uri="http://schemas.openxmlformats.org/drawingml/2006/picture">
                 <pic:pic>
                   <pic:nvPicPr>
-                    <pic:cNvPr id="0" name="drop-leaf-supports.png"/>
+                    <pic:cNvPr id="0" name="image.jpg"/>
                     <pic:cNvPicPr/>
                   </pic:nvPicPr>
                   <pic:blipFill>
-                    <a:blip r:embed="rId14"/>
+                    <a:blip r:embed="rId15"/>
                     <a:stretch>
                       <a:fillRect/>
                     </a:stretch>
@@ -6656,7 +6686,7 @@
                   <pic:spPr>
                     <a:xfrm>
                       <a:off x="0" y="0"/>
-                      <a:ext cx="4023360" cy="1788160"/>
+                      <a:ext cx="4023360" cy="1342078"/>
                     </a:xfrm>
                     <a:prstGeom prst="rect"/>
                   </pic:spPr>
@@ -7243,8 +7273,8 @@
       <w:r>
         <w:drawing>
           <wp:inline xmlns:a="http://schemas.openxmlformats.org/drawingml/2006/main" xmlns:pic="http://schemas.openxmlformats.org/drawingml/2006/picture">
-            <wp:extent cx="4023360" cy="2011680"/>
-            <wp:docPr id="7" name="Picture 7"/>
+            <wp:extent cx="4023360" cy="1342078"/>
+            <wp:docPr id="8" name="Picture 8"/>
             <wp:cNvGraphicFramePr>
               <a:graphicFrameLocks noChangeAspect="1"/>
             </wp:cNvGraphicFramePr>
@@ -7252,11 +7282,11 @@
               <a:graphicData uri="http://schemas.openxmlformats.org/drawingml/2006/picture">
                 <pic:pic>
                   <pic:nvPicPr>
-                    <pic:cNvPr id="0" name="turned-leg-types.png"/>
+                    <pic:cNvPr id="0" name="image.jpg"/>
                     <pic:cNvPicPr/>
                   </pic:nvPicPr>
                   <pic:blipFill>
-                    <a:blip r:embed="rId15"/>
+                    <a:blip r:embed="rId16"/>
                     <a:stretch>
                       <a:fillRect/>
                     </a:stretch>
@@ -7264,7 +7294,7 @@
                   <pic:spPr>
                     <a:xfrm>
                       <a:off x="0" y="0"/>
-                      <a:ext cx="4023360" cy="2011680"/>
+                      <a:ext cx="4023360" cy="1342078"/>
                     </a:xfrm>
                     <a:prstGeom prst="rect"/>
                   </pic:spPr>
@@ -12569,12 +12599,42 @@
       </w:r>
     </w:p>
     <w:p>
-      <w:r>
-        <w:rPr>
-          <w:i/>
-          <w:color w:val="8A7A64"/>
-        </w:rPr>
-        <w:t>[ Decision tree — see the diagram file ]</w:t>
+      <w:pPr>
+        <w:jc w:val="center"/>
+      </w:pPr>
+      <w:r>
+        <w:drawing>
+          <wp:inline xmlns:a="http://schemas.openxmlformats.org/drawingml/2006/main" xmlns:pic="http://schemas.openxmlformats.org/drawingml/2006/picture">
+            <wp:extent cx="4023360" cy="5686095"/>
+            <wp:docPr id="9" name="Picture 9"/>
+            <wp:cNvGraphicFramePr>
+              <a:graphicFrameLocks noChangeAspect="1"/>
+            </wp:cNvGraphicFramePr>
+            <a:graphic>
+              <a:graphicData uri="http://schemas.openxmlformats.org/drawingml/2006/picture">
+                <pic:pic>
+                  <pic:nvPicPr>
+                    <pic:cNvPr id="0" name="image.jpg"/>
+                    <pic:cNvPicPr/>
+                  </pic:nvPicPr>
+                  <pic:blipFill>
+                    <a:blip r:embed="rId17"/>
+                    <a:stretch>
+                      <a:fillRect/>
+                    </a:stretch>
+                  </pic:blipFill>
+                  <pic:spPr>
+                    <a:xfrm>
+                      <a:off x="0" y="0"/>
+                      <a:ext cx="4023360" cy="5686095"/>
+                    </a:xfrm>
+                    <a:prstGeom prst="rect"/>
+                  </pic:spPr>
+                </pic:pic>
+              </a:graphicData>
+            </a:graphic>
+          </wp:inline>
+        </w:drawing>
       </w:r>
     </w:p>
     <w:p>
@@ -14430,12 +14490,42 @@
       </w:r>
     </w:p>
     <w:p>
-      <w:r>
-        <w:rPr>
-          <w:i/>
-          <w:color w:val="8A7A64"/>
-        </w:rPr>
-        <w:t>[ Decision tree — see the diagram file ]</w:t>
+      <w:pPr>
+        <w:jc w:val="center"/>
+      </w:pPr>
+      <w:r>
+        <w:drawing>
+          <wp:inline xmlns:a="http://schemas.openxmlformats.org/drawingml/2006/main" xmlns:pic="http://schemas.openxmlformats.org/drawingml/2006/picture">
+            <wp:extent cx="4023360" cy="6035040"/>
+            <wp:docPr id="10" name="Picture 10"/>
+            <wp:cNvGraphicFramePr>
+              <a:graphicFrameLocks noChangeAspect="1"/>
+            </wp:cNvGraphicFramePr>
+            <a:graphic>
+              <a:graphicData uri="http://schemas.openxmlformats.org/drawingml/2006/picture">
+                <pic:pic>
+                  <pic:nvPicPr>
+                    <pic:cNvPr id="0" name="image.jpg"/>
+                    <pic:cNvPicPr/>
+                  </pic:nvPicPr>
+                  <pic:blipFill>
+                    <a:blip r:embed="rId18"/>
+                    <a:stretch>
+                      <a:fillRect/>
+                    </a:stretch>
+                  </pic:blipFill>
+                  <pic:spPr>
+                    <a:xfrm>
+                      <a:off x="0" y="0"/>
+                      <a:ext cx="4023360" cy="6035040"/>
+                    </a:xfrm>
+                    <a:prstGeom prst="rect"/>
+                  </pic:spPr>
+                </pic:pic>
+              </a:graphicData>
+            </a:graphic>
+          </wp:inline>
+        </w:drawing>
       </w:r>
     </w:p>
     <w:p>
@@ -15097,7 +15187,7 @@
         <w:drawing>
           <wp:inline xmlns:a="http://schemas.openxmlformats.org/drawingml/2006/main" xmlns:pic="http://schemas.openxmlformats.org/drawingml/2006/picture">
             <wp:extent cx="4023360" cy="3017520"/>
-            <wp:docPr id="8" name="Picture 8"/>
+            <wp:docPr id="11" name="Picture 11"/>
             <wp:cNvGraphicFramePr>
               <a:graphicFrameLocks noChangeAspect="1"/>
             </wp:cNvGraphicFramePr>
@@ -15105,11 +15195,11 @@
               <a:graphicData uri="http://schemas.openxmlformats.org/drawingml/2006/picture">
                 <pic:pic>
                   <pic:nvPicPr>
-                    <pic:cNvPr id="0" name="hoosier-anatomy.png"/>
+                    <pic:cNvPr id="0" name="image.jpg"/>
                     <pic:cNvPicPr/>
                   </pic:nvPicPr>
                   <pic:blipFill>
-                    <a:blip r:embed="rId16"/>
+                    <a:blip r:embed="rId19"/>
                     <a:stretch>
                       <a:fillRect/>
                     </a:stretch>
@@ -15834,8 +15924,8 @@
       <w:r>
         <w:drawing>
           <wp:inline xmlns:a="http://schemas.openxmlformats.org/drawingml/2006/main" xmlns:pic="http://schemas.openxmlformats.org/drawingml/2006/picture">
-            <wp:extent cx="4023360" cy="1676400"/>
-            <wp:docPr id="9" name="Picture 9"/>
+            <wp:extent cx="4023360" cy="1342078"/>
+            <wp:docPr id="12" name="Picture 12"/>
             <wp:cNvGraphicFramePr>
               <a:graphicFrameLocks noChangeAspect="1"/>
             </wp:cNvGraphicFramePr>
@@ -15843,11 +15933,11 @@
               <a:graphicData uri="http://schemas.openxmlformats.org/drawingml/2006/picture">
                 <pic:pic>
                   <pic:nvPicPr>
-                    <pic:cNvPr id="0" name="blanket-chest-feet.png"/>
+                    <pic:cNvPr id="0" name="image.jpg"/>
                     <pic:cNvPicPr/>
                   </pic:nvPicPr>
                   <pic:blipFill>
-                    <a:blip r:embed="rId17"/>
+                    <a:blip r:embed="rId20"/>
                     <a:stretch>
                       <a:fillRect/>
                     </a:stretch>
@@ -15855,7 +15945,7 @@
                   <pic:spPr>
                     <a:xfrm>
                       <a:off x="0" y="0"/>
-                      <a:ext cx="4023360" cy="1676400"/>
+                      <a:ext cx="4023360" cy="1342078"/>
                     </a:xfrm>
                     <a:prstGeom prst="rect"/>
                   </pic:spPr>
@@ -18569,8 +18659,8 @@
       <w:r>
         <w:drawing>
           <wp:inline xmlns:a="http://schemas.openxmlformats.org/drawingml/2006/main" xmlns:pic="http://schemas.openxmlformats.org/drawingml/2006/picture">
-            <wp:extent cx="4023360" cy="1788160"/>
-            <wp:docPr id="10" name="Picture 10"/>
+            <wp:extent cx="4023360" cy="2681282"/>
+            <wp:docPr id="13" name="Picture 13"/>
             <wp:cNvGraphicFramePr>
               <a:graphicFrameLocks noChangeAspect="1"/>
             </wp:cNvGraphicFramePr>
@@ -18578,11 +18668,11 @@
               <a:graphicData uri="http://schemas.openxmlformats.org/drawingml/2006/picture">
                 <pic:pic>
                   <pic:nvPicPr>
-                    <pic:cNvPr id="0" name="roll-top-covers.png"/>
+                    <pic:cNvPr id="0" name="image.jpg"/>
                     <pic:cNvPicPr/>
                   </pic:nvPicPr>
                   <pic:blipFill>
-                    <a:blip r:embed="rId18"/>
+                    <a:blip r:embed="rId21"/>
                     <a:stretch>
                       <a:fillRect/>
                     </a:stretch>
@@ -18590,7 +18680,7 @@
                   <pic:spPr>
                     <a:xfrm>
                       <a:off x="0" y="0"/>
-                      <a:ext cx="4023360" cy="1788160"/>
+                      <a:ext cx="4023360" cy="2681282"/>
                     </a:xfrm>
                     <a:prstGeom prst="rect"/>
                   </pic:spPr>
@@ -20085,8 +20175,8 @@
       <w:r>
         <w:drawing>
           <wp:inline xmlns:a="http://schemas.openxmlformats.org/drawingml/2006/main" xmlns:pic="http://schemas.openxmlformats.org/drawingml/2006/picture">
-            <wp:extent cx="4023360" cy="1801571"/>
-            <wp:docPr id="11" name="Picture 11"/>
+            <wp:extent cx="4023360" cy="2847964"/>
+            <wp:docPr id="14" name="Picture 14"/>
             <wp:cNvGraphicFramePr>
               <a:graphicFrameLocks noChangeAspect="1"/>
             </wp:cNvGraphicFramePr>
@@ -20094,11 +20184,11 @@
               <a:graphicData uri="http://schemas.openxmlformats.org/drawingml/2006/picture">
                 <pic:pic>
                   <pic:nvPicPr>
-                    <pic:cNvPr id="0" name="bedstead-subtypes.png"/>
+                    <pic:cNvPr id="0" name="image.jpg"/>
                     <pic:cNvPicPr/>
                   </pic:nvPicPr>
                   <pic:blipFill>
-                    <a:blip r:embed="rId19"/>
+                    <a:blip r:embed="rId22"/>
                     <a:stretch>
                       <a:fillRect/>
                     </a:stretch>
@@ -20106,7 +20196,7 @@
                   <pic:spPr>
                     <a:xfrm>
                       <a:off x="0" y="0"/>
-                      <a:ext cx="4023360" cy="1801571"/>
+                      <a:ext cx="4023360" cy="2847964"/>
                     </a:xfrm>
                     <a:prstGeom prst="rect"/>
                   </pic:spPr>
@@ -21890,8 +21980,8 @@
       <w:r>
         <w:drawing>
           <wp:inline xmlns:a="http://schemas.openxmlformats.org/drawingml/2006/main" xmlns:pic="http://schemas.openxmlformats.org/drawingml/2006/picture">
-            <wp:extent cx="4023360" cy="2346960"/>
-            <wp:docPr id="12" name="Picture 12"/>
+            <wp:extent cx="4023360" cy="2681282"/>
+            <wp:docPr id="15" name="Picture 15"/>
             <wp:cNvGraphicFramePr>
               <a:graphicFrameLocks noChangeAspect="1"/>
             </wp:cNvGraphicFramePr>
@@ -21899,11 +21989,11 @@
               <a:graphicData uri="http://schemas.openxmlformats.org/drawingml/2006/picture">
                 <pic:pic>
                   <pic:nvPicPr>
-                    <pic:cNvPr id="0" name="clock-silhouettes.png"/>
+                    <pic:cNvPr id="0" name="image.jpg"/>
                     <pic:cNvPicPr/>
                   </pic:nvPicPr>
                   <pic:blipFill>
-                    <a:blip r:embed="rId20"/>
+                    <a:blip r:embed="rId23"/>
                     <a:stretch>
                       <a:fillRect/>
                     </a:stretch>
@@ -21911,7 +22001,7 @@
                   <pic:spPr>
                     <a:xfrm>
                       <a:off x="0" y="0"/>
-                      <a:ext cx="4023360" cy="2346960"/>
+                      <a:ext cx="4023360" cy="2681282"/>
                     </a:xfrm>
                     <a:prstGeom prst="rect"/>
                   </pic:spPr>
@@ -21951,8 +22041,8 @@
       <w:r>
         <w:drawing>
           <wp:inline xmlns:a="http://schemas.openxmlformats.org/drawingml/2006/main" xmlns:pic="http://schemas.openxmlformats.org/drawingml/2006/picture">
-            <wp:extent cx="4023360" cy="2123440"/>
-            <wp:docPr id="13" name="Picture 13"/>
+            <wp:extent cx="4023360" cy="2681282"/>
+            <wp:docPr id="16" name="Picture 16"/>
             <wp:cNvGraphicFramePr>
               <a:graphicFrameLocks noChangeAspect="1"/>
             </wp:cNvGraphicFramePr>
@@ -21960,11 +22050,11 @@
               <a:graphicData uri="http://schemas.openxmlformats.org/drawingml/2006/picture">
                 <pic:pic>
                   <pic:nvPicPr>
-                    <pic:cNvPr id="0" name="fasteners-nail-types.png"/>
+                    <pic:cNvPr id="0" name="image.jpg"/>
                     <pic:cNvPicPr/>
                   </pic:nvPicPr>
                   <pic:blipFill>
-                    <a:blip r:embed="rId21"/>
+                    <a:blip r:embed="rId24"/>
                     <a:stretch>
                       <a:fillRect/>
                     </a:stretch>
@@ -21972,7 +22062,7 @@
                   <pic:spPr>
                     <a:xfrm>
                       <a:off x="0" y="0"/>
-                      <a:ext cx="4023360" cy="2123440"/>
+                      <a:ext cx="4023360" cy="2681282"/>
                     </a:xfrm>
                     <a:prstGeom prst="rect"/>
                   </pic:spPr>
@@ -21990,8 +22080,8 @@
       <w:r>
         <w:drawing>
           <wp:inline xmlns:a="http://schemas.openxmlformats.org/drawingml/2006/main" xmlns:pic="http://schemas.openxmlformats.org/drawingml/2006/picture">
-            <wp:extent cx="4023360" cy="1841805"/>
-            <wp:docPr id="14" name="Picture 14"/>
+            <wp:extent cx="4023360" cy="3017520"/>
+            <wp:docPr id="17" name="Picture 17"/>
             <wp:cNvGraphicFramePr>
               <a:graphicFrameLocks noChangeAspect="1"/>
             </wp:cNvGraphicFramePr>
@@ -21999,11 +22089,11 @@
               <a:graphicData uri="http://schemas.openxmlformats.org/drawingml/2006/picture">
                 <pic:pic>
                   <pic:nvPicPr>
-                    <pic:cNvPr id="0" name="fasteners-screws.png"/>
+                    <pic:cNvPr id="0" name="image.jpg"/>
                     <pic:cNvPicPr/>
                   </pic:nvPicPr>
                   <pic:blipFill>
-                    <a:blip r:embed="rId22"/>
+                    <a:blip r:embed="rId25"/>
                     <a:stretch>
                       <a:fillRect/>
                     </a:stretch>
@@ -22011,7 +22101,7 @@
                   <pic:spPr>
                     <a:xfrm>
                       <a:off x="0" y="0"/>
-                      <a:ext cx="4023360" cy="1841805"/>
+                      <a:ext cx="4023360" cy="3017520"/>
                     </a:xfrm>
                     <a:prstGeom prst="rect"/>
                   </pic:spPr>
@@ -22565,8 +22655,8 @@
       <w:r>
         <w:drawing>
           <wp:inline xmlns:a="http://schemas.openxmlformats.org/drawingml/2006/main" xmlns:pic="http://schemas.openxmlformats.org/drawingml/2006/picture">
-            <wp:extent cx="4023360" cy="2123440"/>
-            <wp:docPr id="15" name="Picture 15"/>
+            <wp:extent cx="4023360" cy="2681282"/>
+            <wp:docPr id="18" name="Picture 18"/>
             <wp:cNvGraphicFramePr>
               <a:graphicFrameLocks noChangeAspect="1"/>
             </wp:cNvGraphicFramePr>
@@ -22574,11 +22664,11 @@
               <a:graphicData uri="http://schemas.openxmlformats.org/drawingml/2006/picture">
                 <pic:pic>
                   <pic:nvPicPr>
-                    <pic:cNvPr id="0" name="fasteners-nail-types.png"/>
+                    <pic:cNvPr id="0" name="image.jpg"/>
                     <pic:cNvPicPr/>
                   </pic:nvPicPr>
                   <pic:blipFill>
-                    <a:blip r:embed="rId21"/>
+                    <a:blip r:embed="rId24"/>
                     <a:stretch>
                       <a:fillRect/>
                     </a:stretch>
@@ -22586,7 +22676,7 @@
                   <pic:spPr>
                     <a:xfrm>
                       <a:off x="0" y="0"/>
-                      <a:ext cx="4023360" cy="2123440"/>
+                      <a:ext cx="4023360" cy="2681282"/>
                     </a:xfrm>
                     <a:prstGeom prst="rect"/>
                   </pic:spPr>
@@ -22604,8 +22694,8 @@
       <w:r>
         <w:drawing>
           <wp:inline xmlns:a="http://schemas.openxmlformats.org/drawingml/2006/main" xmlns:pic="http://schemas.openxmlformats.org/drawingml/2006/picture">
-            <wp:extent cx="4023360" cy="1841805"/>
-            <wp:docPr id="16" name="Picture 16"/>
+            <wp:extent cx="4023360" cy="3017520"/>
+            <wp:docPr id="19" name="Picture 19"/>
             <wp:cNvGraphicFramePr>
               <a:graphicFrameLocks noChangeAspect="1"/>
             </wp:cNvGraphicFramePr>
@@ -22613,11 +22703,11 @@
               <a:graphicData uri="http://schemas.openxmlformats.org/drawingml/2006/picture">
                 <pic:pic>
                   <pic:nvPicPr>
-                    <pic:cNvPr id="0" name="fasteners-screws.png"/>
+                    <pic:cNvPr id="0" name="image.jpg"/>
                     <pic:cNvPicPr/>
                   </pic:nvPicPr>
                   <pic:blipFill>
-                    <a:blip r:embed="rId22"/>
+                    <a:blip r:embed="rId25"/>
                     <a:stretch>
                       <a:fillRect/>
                     </a:stretch>
@@ -22625,7 +22715,7 @@
                   <pic:spPr>
                     <a:xfrm>
                       <a:off x="0" y="0"/>
-                      <a:ext cx="4023360" cy="1841805"/>
+                      <a:ext cx="4023360" cy="3017520"/>
                     </a:xfrm>
                     <a:prstGeom prst="rect"/>
                   </pic:spPr>
@@ -22648,8 +22738,8 @@
       <w:r>
         <w:drawing>
           <wp:inline xmlns:a="http://schemas.openxmlformats.org/drawingml/2006/main" xmlns:pic="http://schemas.openxmlformats.org/drawingml/2006/picture">
-            <wp:extent cx="4023360" cy="2123440"/>
-            <wp:docPr id="17" name="Picture 17"/>
+            <wp:extent cx="4023360" cy="2681282"/>
+            <wp:docPr id="20" name="Picture 20"/>
             <wp:cNvGraphicFramePr>
               <a:graphicFrameLocks noChangeAspect="1"/>
             </wp:cNvGraphicFramePr>
@@ -22657,11 +22747,11 @@
               <a:graphicData uri="http://schemas.openxmlformats.org/drawingml/2006/picture">
                 <pic:pic>
                   <pic:nvPicPr>
-                    <pic:cNvPr id="0" name="joinery-dovetails.png"/>
+                    <pic:cNvPr id="0" name="image.jpg"/>
                     <pic:cNvPicPr/>
                   </pic:nvPicPr>
                   <pic:blipFill>
-                    <a:blip r:embed="rId23"/>
+                    <a:blip r:embed="rId26"/>
                     <a:stretch>
                       <a:fillRect/>
                     </a:stretch>
@@ -22669,7 +22759,7 @@
                   <pic:spPr>
                     <a:xfrm>
                       <a:off x="0" y="0"/>
-                      <a:ext cx="4023360" cy="2123440"/>
+                      <a:ext cx="4023360" cy="2681282"/>
                     </a:xfrm>
                     <a:prstGeom prst="rect"/>
                   </pic:spPr>
@@ -23382,8 +23472,8 @@
       <w:r>
         <w:drawing>
           <wp:inline xmlns:a="http://schemas.openxmlformats.org/drawingml/2006/main" xmlns:pic="http://schemas.openxmlformats.org/drawingml/2006/picture">
-            <wp:extent cx="4023360" cy="2011680"/>
-            <wp:docPr id="18" name="Picture 18"/>
+            <wp:extent cx="4023360" cy="3017520"/>
+            <wp:docPr id="21" name="Picture 21"/>
             <wp:cNvGraphicFramePr>
               <a:graphicFrameLocks noChangeAspect="1"/>
             </wp:cNvGraphicFramePr>
@@ -23391,11 +23481,11 @@
               <a:graphicData uri="http://schemas.openxmlformats.org/drawingml/2006/picture">
                 <pic:pic>
                   <pic:nvPicPr>
-                    <pic:cNvPr id="0" name="mortise-and-tenon.png"/>
+                    <pic:cNvPr id="0" name="image.jpg"/>
                     <pic:cNvPicPr/>
                   </pic:nvPicPr>
                   <pic:blipFill>
-                    <a:blip r:embed="rId24"/>
+                    <a:blip r:embed="rId27"/>
                     <a:stretch>
                       <a:fillRect/>
                     </a:stretch>
@@ -23403,7 +23493,7 @@
                   <pic:spPr>
                     <a:xfrm>
                       <a:off x="0" y="0"/>
-                      <a:ext cx="4023360" cy="2011680"/>
+                      <a:ext cx="4023360" cy="3017520"/>
                     </a:xfrm>
                     <a:prstGeom prst="rect"/>
                   </pic:spPr>

</xml_diff>